<commit_message>
Docs: reword the optional AI triage notes; rebuild PDF and Word summary
</commit_message>
<xml_diff>
--- a/docs/PROJECT_SUMMARY.docx
+++ b/docs/PROJECT_SUMMARY.docx
@@ -47,7 +47,7 @@
     </w:p>
     <w:p>
       <w:r>
-        <w:t xml:space="preserve">Employees paste source code, customer data and credentials into consumer AI tools (ChatGPT, Claude, Gemini and others) that the company never vetted. Most security teams cannot see it. Shadow-AI Radar reads egress-proxy logs and answers four questions: </w:t>
+        <w:t xml:space="preserve">Employees paste source code, customer data and credentials into consumer AI tools (ChatGPT, Gemini and others) that the company never vetted. Most security teams cannot see it. Shadow-AI Radar reads egress-proxy logs and answers four questions: </w:t>
       </w:r>
       <w:r>
         <w:rPr>
@@ -349,7 +349,7 @@
               <w:rPr>
                 <w:sz w:val="18"/>
               </w:rPr>
-              <w:t xml:space="preserve">Prompt-sensitivity classifier (public / internal / confidential / source code) with labelling → training → evaluation loop (active learning, held-out sets, per-class precision/recall); optional Claude triage summaries with an offline fallback; classifier down-weighted until trained on real data</w:t>
+              <w:t xml:space="preserve">Prompt-sensitivity classifier (public / internal / confidential / source code) with labelling → training → evaluation loop (active learning, held-out sets, per-class precision/recall); optional AI triage summaries with an offline fallback; classifier down-weighted until trained on real data</w:t>
             </w:r>
           </w:p>
         </w:tc>

</xml_diff>